<commit_message>
chore: lower Node.js requirement to 18.3+
The code only uses APIs available in Node 18.3+: util.parseArgs,
node:test runner, crypto.randomInt/randomUUID, node: import prefix.
On Node 18 these are experimental (warnings in stderr), but functional
— all 108 tests pass on both 18.x and 20.x.

- package.json: engines >= 20 → >= 18.3
- README.md: badge ≥20 → ≥18.3, install text mentions warning behavior
- docs/DEPLOY-UBUNTU.docx: Step 2 split into Variant A (Node 20 LTS) and
  Variant B (Node 18 LTS), plus a fallback for conflict with stock
  Ubuntu nodejs package

Unblocks setup on laptops where the Node 20 NodeSource setup fails.
</commit_message>
<xml_diff>
--- a/docs/DEPLOY-UBUNTU.docx
+++ b/docs/DEPLOY-UBUNTU.docx
@@ -571,7 +571,7 @@
           <w:sz w:val="36"/>
           <w:szCs w:val="36"/>
         </w:rPr>
-        <w:t xml:space="preserve">Шаг 2. Установка Node.js 20 или новее</w:t>
+        <w:t xml:space="preserve">Шаг 2. Установка Node.js (18.3+ или 20 LTS)</w:t>
       </w:r>
     </w:p>
     <w:p>
@@ -584,7 +584,37 @@
           <w:sz w:val="22"/>
           <w:szCs w:val="22"/>
         </w:rPr>
-        <w:t xml:space="preserve">В репозиториях Ubuntu 24.04 версия Node.js может быть устаревшей (12 или 18). Поставим актуальный 20 LTS через официальный репозиторий NodeSource.</w:t>
+        <w:t xml:space="preserve">Минимальная требуемая версия Node.js — 18.3. Рекомендуется LTS 20+, но если по каким-то причинам 20 не ставится — 18 LTS подойдёт без проблем (код полностью совместим, появится только experimental-warning про parseArgs и test-runner в логах — это шум, не ошибка).</w:t>
+      </w:r>
+    </w:p>
+    <w:p>
+      <w:pPr>
+        <w:spacing w:after="120" w:line="300"/>
+      </w:pPr>
+      <w:r>
+        <w:rPr>
+          <w:rFonts w:ascii="Arial" w:cs="Arial" w:eastAsia="Arial" w:hAnsi="Arial"/>
+          <w:sz w:val="22"/>
+          <w:szCs w:val="22"/>
+        </w:rPr>
+        <w:t xml:space="preserve">В репозиториях Ubuntu 24.04 версия Node.js может быть устаревшей. Ставим актуальную через официальный репозиторий NodeSource.</w:t>
+      </w:r>
+    </w:p>
+    <w:p>
+      <w:pPr>
+        <w:pStyle w:val="Heading3"/>
+        <w:spacing w:after="120" w:before="200"/>
+      </w:pPr>
+      <w:r>
+        <w:rPr>
+          <w:rFonts w:ascii="Arial" w:cs="Arial" w:eastAsia="Arial" w:hAnsi="Arial"/>
+          <w:b/>
+          <w:bCs/>
+          <w:color w:val="000000"/>
+          <w:sz w:val="24"/>
+          <w:szCs w:val="24"/>
+        </w:rPr>
+        <w:t xml:space="preserve">Вариант A — Node.js 20 LTS (рекомендуется для нового сервера)</w:t>
       </w:r>
     </w:p>
     <w:tbl>
@@ -674,7 +704,7 @@
           </w:p>
           <w:p>
             <w:pPr>
-              <w:spacing w:after="40" w:line="260"/>
+              <w:spacing w:after="0" w:line="260"/>
             </w:pPr>
             <w:r>
               <w:rPr>
@@ -683,58 +713,6 @@
                 <w:szCs w:val="20"/>
               </w:rPr>
               <w:t xml:space="preserve">sudo apt install -y nodejs</w:t>
-            </w:r>
-          </w:p>
-          <w:p>
-            <w:pPr>
-              <w:spacing w:after="40" w:line="260"/>
-            </w:pPr>
-            <w:r>
-              <w:rPr>
-                <w:rFonts w:ascii="Consolas" w:cs="Consolas" w:eastAsia="Consolas" w:hAnsi="Consolas"/>
-                <w:sz w:val="20"/>
-                <w:szCs w:val="20"/>
-              </w:rPr>
-              <w:t xml:space="preserve"> </w:t>
-            </w:r>
-          </w:p>
-          <w:p>
-            <w:pPr>
-              <w:spacing w:after="40" w:line="260"/>
-            </w:pPr>
-            <w:r>
-              <w:rPr>
-                <w:rFonts w:ascii="Consolas" w:cs="Consolas" w:eastAsia="Consolas" w:hAnsi="Consolas"/>
-                <w:sz w:val="20"/>
-                <w:szCs w:val="20"/>
-              </w:rPr>
-              <w:t xml:space="preserve"># Проверка</w:t>
-            </w:r>
-          </w:p>
-          <w:p>
-            <w:pPr>
-              <w:spacing w:after="40" w:line="260"/>
-            </w:pPr>
-            <w:r>
-              <w:rPr>
-                <w:rFonts w:ascii="Consolas" w:cs="Consolas" w:eastAsia="Consolas" w:hAnsi="Consolas"/>
-                <w:sz w:val="20"/>
-                <w:szCs w:val="20"/>
-              </w:rPr>
-              <w:t xml:space="preserve">node --version    # должно быть v20.x.x (или новее)</w:t>
-            </w:r>
-          </w:p>
-          <w:p>
-            <w:pPr>
-              <w:spacing w:after="0" w:line="260"/>
-            </w:pPr>
-            <w:r>
-              <w:rPr>
-                <w:rFonts w:ascii="Consolas" w:cs="Consolas" w:eastAsia="Consolas" w:hAnsi="Consolas"/>
-                <w:sz w:val="20"/>
-                <w:szCs w:val="20"/>
-              </w:rPr>
-              <w:t xml:space="preserve">npm --version     # должно быть 10.x.x или новее</w:t>
             </w:r>
           </w:p>
         </w:tc>
@@ -742,56 +720,19 @@
     </w:tbl>
     <w:p>
       <w:pPr>
-        <w:spacing w:after="120" w:line="300"/>
-      </w:pPr>
-      <w:r>
-        <w:rPr>
-          <w:rFonts w:ascii="Arial" w:cs="Arial" w:eastAsia="Arial" w:hAnsi="Arial"/>
-          <w:sz w:val="22"/>
-          <w:szCs w:val="22"/>
-        </w:rPr>
-        <w:t xml:space="preserve">Документация NodeSource: </w:t>
-      </w:r>
-      <w:hyperlink w:history="1" r:id="rIdqov0elf7cr_a8nhsvsb3l">
-        <w:r>
-          <w:rPr>
-            <w:rStyle w:val="Hyperlink"/>
-            <w:rFonts w:ascii="Arial" w:cs="Arial" w:eastAsia="Arial" w:hAnsi="Arial"/>
-            <w:sz w:val="22"/>
-            <w:szCs w:val="22"/>
-          </w:rPr>
-          <w:t xml:space="preserve">github.com/nodesource/distributions</w:t>
-        </w:r>
-      </w:hyperlink>
-    </w:p>
-    <w:p>
-      <w:pPr>
-        <w:pStyle w:val="Heading1"/>
-        <w:spacing w:after="200" w:before="360"/>
+        <w:pStyle w:val="Heading3"/>
+        <w:spacing w:after="120" w:before="200"/>
       </w:pPr>
       <w:r>
         <w:rPr>
           <w:rFonts w:ascii="Arial" w:cs="Arial" w:eastAsia="Arial" w:hAnsi="Arial"/>
           <w:b/>
           <w:bCs/>
-          <w:color w:val="1F4E79"/>
-          <w:sz w:val="36"/>
-          <w:szCs w:val="36"/>
-        </w:rPr>
-        <w:t xml:space="preserve">Шаг 3. Клонирование репозитория</w:t>
-      </w:r>
-    </w:p>
-    <w:p>
-      <w:pPr>
-        <w:spacing w:after="120" w:line="300"/>
-      </w:pPr>
-      <w:r>
-        <w:rPr>
-          <w:rFonts w:ascii="Arial" w:cs="Arial" w:eastAsia="Arial" w:hAnsi="Arial"/>
-          <w:sz w:val="22"/>
-          <w:szCs w:val="22"/>
-        </w:rPr>
-        <w:t xml:space="preserve">Создадим папку для проекта в домашней директории и склонируем туда ветку online-v0.5.</w:t>
+          <w:color w:val="000000"/>
+          <w:sz w:val="24"/>
+          <w:szCs w:val="24"/>
+        </w:rPr>
+        <w:t xml:space="preserve">Вариант B — Node.js 18 LTS (если 20 не ставится / уже стоит 18)</w:t>
       </w:r>
     </w:p>
     <w:tbl>
@@ -837,46 +778,20 @@
                 <w:sz w:val="20"/>
                 <w:szCs w:val="20"/>
               </w:rPr>
-              <w:t xml:space="preserve">cd ~</w:t>
-            </w:r>
-          </w:p>
-          <w:p>
-            <w:pPr>
-              <w:spacing w:after="40" w:line="260"/>
-            </w:pPr>
-            <w:r>
-              <w:rPr>
-                <w:rFonts w:ascii="Consolas" w:cs="Consolas" w:eastAsia="Consolas" w:hAnsi="Consolas"/>
-                <w:sz w:val="20"/>
-                <w:szCs w:val="20"/>
-              </w:rPr>
-              <w:t xml:space="preserve">git clone https://github.com/Lelbry/Kcd_dice_web_lan.git kcd2-dice</w:t>
-            </w:r>
-          </w:p>
-          <w:p>
-            <w:pPr>
-              <w:spacing w:after="40" w:line="260"/>
-            </w:pPr>
-            <w:r>
-              <w:rPr>
-                <w:rFonts w:ascii="Consolas" w:cs="Consolas" w:eastAsia="Consolas" w:hAnsi="Consolas"/>
-                <w:sz w:val="20"/>
-                <w:szCs w:val="20"/>
-              </w:rPr>
-              <w:t xml:space="preserve">cd kcd2-dice</w:t>
-            </w:r>
-          </w:p>
-          <w:p>
-            <w:pPr>
-              <w:spacing w:after="40" w:line="260"/>
-            </w:pPr>
-            <w:r>
-              <w:rPr>
-                <w:rFonts w:ascii="Consolas" w:cs="Consolas" w:eastAsia="Consolas" w:hAnsi="Consolas"/>
-                <w:sz w:val="20"/>
-                <w:szCs w:val="20"/>
-              </w:rPr>
-              <w:t xml:space="preserve">git checkout online-v0.5</w:t>
+              <w:t xml:space="preserve"># Подключение репозитория NodeSource для Node.js 18</w:t>
+            </w:r>
+          </w:p>
+          <w:p>
+            <w:pPr>
+              <w:spacing w:after="40" w:line="260"/>
+            </w:pPr>
+            <w:r>
+              <w:rPr>
+                <w:rFonts w:ascii="Consolas" w:cs="Consolas" w:eastAsia="Consolas" w:hAnsi="Consolas"/>
+                <w:sz w:val="20"/>
+                <w:szCs w:val="20"/>
+              </w:rPr>
+              <w:t xml:space="preserve">curl -fsSL https://deb.nodesource.com/setup_18.x | sudo -E bash -</w:t>
             </w:r>
           </w:p>
           <w:p>
@@ -902,46 +817,7 @@
                 <w:sz w:val="20"/>
                 <w:szCs w:val="20"/>
               </w:rPr>
-              <w:t xml:space="preserve"># Установка зависимостей (express + ws)</w:t>
-            </w:r>
-          </w:p>
-          <w:p>
-            <w:pPr>
-              <w:spacing w:after="40" w:line="260"/>
-            </w:pPr>
-            <w:r>
-              <w:rPr>
-                <w:rFonts w:ascii="Consolas" w:cs="Consolas" w:eastAsia="Consolas" w:hAnsi="Consolas"/>
-                <w:sz w:val="20"/>
-                <w:szCs w:val="20"/>
-              </w:rPr>
-              <w:t xml:space="preserve">npm install</w:t>
-            </w:r>
-          </w:p>
-          <w:p>
-            <w:pPr>
-              <w:spacing w:after="40" w:line="260"/>
-            </w:pPr>
-            <w:r>
-              <w:rPr>
-                <w:rFonts w:ascii="Consolas" w:cs="Consolas" w:eastAsia="Consolas" w:hAnsi="Consolas"/>
-                <w:sz w:val="20"/>
-                <w:szCs w:val="20"/>
-              </w:rPr>
-              <w:t xml:space="preserve"> </w:t>
-            </w:r>
-          </w:p>
-          <w:p>
-            <w:pPr>
-              <w:spacing w:after="40" w:line="260"/>
-            </w:pPr>
-            <w:r>
-              <w:rPr>
-                <w:rFonts w:ascii="Consolas" w:cs="Consolas" w:eastAsia="Consolas" w:hAnsi="Consolas"/>
-                <w:sz w:val="20"/>
-                <w:szCs w:val="20"/>
-              </w:rPr>
-              <w:t xml:space="preserve"># Опционально — прогон тестов движка</w:t>
+              <w:t xml:space="preserve"># Установка</w:t>
             </w:r>
           </w:p>
           <w:p>
@@ -954,7 +830,7 @@
                 <w:sz w:val="20"/>
                 <w:szCs w:val="20"/>
               </w:rPr>
-              <w:t xml:space="preserve">npm test</w:t>
+              <w:t xml:space="preserve">sudo apt install -y nodejs</w:t>
             </w:r>
           </w:p>
         </w:tc>
@@ -970,37 +846,7 @@
           <w:sz w:val="22"/>
           <w:szCs w:val="22"/>
         </w:rPr>
-        <w:t xml:space="preserve">После npm test должно отобразиться «pass 108, fail 0». Если есть сбои — остановитесь, не идём дальше.</w:t>
-      </w:r>
-    </w:p>
-    <w:p>
-      <w:pPr>
-        <w:pStyle w:val="Heading1"/>
-        <w:spacing w:after="200" w:before="360"/>
-      </w:pPr>
-      <w:r>
-        <w:rPr>
-          <w:rFonts w:ascii="Arial" w:cs="Arial" w:eastAsia="Arial" w:hAnsi="Arial"/>
-          <w:b/>
-          <w:bCs/>
-          <w:color w:val="1F4E79"/>
-          <w:sz w:val="36"/>
-          <w:szCs w:val="36"/>
-        </w:rPr>
-        <w:t xml:space="preserve">Шаг 4. Локальная проверка сервера</w:t>
-      </w:r>
-    </w:p>
-    <w:p>
-      <w:pPr>
-        <w:spacing w:after="120" w:line="300"/>
-      </w:pPr>
-      <w:r>
-        <w:rPr>
-          <w:rFonts w:ascii="Arial" w:cs="Arial" w:eastAsia="Arial" w:hAnsi="Arial"/>
-          <w:sz w:val="22"/>
-          <w:szCs w:val="22"/>
-        </w:rPr>
-        <w:t xml:space="preserve">Прежде чем настраивать туннель, проверим, что сервер вообще запускается.</w:t>
+        <w:t xml:space="preserve">Если apt ругается на конфликт с уже стоящим nodejs из стандартных репозиториев Ubuntu, перед NodeSource-установкой выполните:</w:t>
       </w:r>
     </w:p>
     <w:tbl>
@@ -1046,7 +892,7 @@
                 <w:sz w:val="20"/>
                 <w:szCs w:val="20"/>
               </w:rPr>
-              <w:t xml:space="preserve">cd ~/kcd2-dice</w:t>
+              <w:t xml:space="preserve">sudo apt remove --purge -y nodejs libnode-dev npm</w:t>
             </w:r>
           </w:p>
           <w:p>
@@ -1059,7 +905,7 @@
                 <w:sz w:val="20"/>
                 <w:szCs w:val="20"/>
               </w:rPr>
-              <w:t xml:space="preserve">PORT=8080 npm start</w:t>
+              <w:t xml:space="preserve">sudo apt autoremove -y</w:t>
             </w:r>
           </w:p>
         </w:tc>
@@ -1067,15 +913,19 @@
     </w:tbl>
     <w:p>
       <w:pPr>
-        <w:spacing w:after="120" w:line="300"/>
-      </w:pPr>
-      <w:r>
-        <w:rPr>
-          <w:rFonts w:ascii="Arial" w:cs="Arial" w:eastAsia="Arial" w:hAnsi="Arial"/>
-          <w:sz w:val="22"/>
-          <w:szCs w:val="22"/>
-        </w:rPr>
-        <w:t xml:space="preserve">Должны увидеть:</w:t>
+        <w:pStyle w:val="Heading3"/>
+        <w:spacing w:after="120" w:before="200"/>
+      </w:pPr>
+      <w:r>
+        <w:rPr>
+          <w:rFonts w:ascii="Arial" w:cs="Arial" w:eastAsia="Arial" w:hAnsi="Arial"/>
+          <w:b/>
+          <w:bCs/>
+          <w:color w:val="000000"/>
+          <w:sz w:val="24"/>
+          <w:szCs w:val="24"/>
+        </w:rPr>
+        <w:t xml:space="preserve">Проверка</w:t>
       </w:r>
     </w:p>
     <w:tbl>
@@ -1121,20 +971,7 @@
                 <w:sz w:val="20"/>
                 <w:szCs w:val="20"/>
               </w:rPr>
-              <w:t xml:space="preserve">[WARN] ALLOWED_ORIGINS не задан — Origin не проверяется...</w:t>
-            </w:r>
-          </w:p>
-          <w:p>
-            <w:pPr>
-              <w:spacing w:after="40" w:line="260"/>
-            </w:pPr>
-            <w:r>
-              <w:rPr>
-                <w:rFonts w:ascii="Consolas" w:cs="Consolas" w:eastAsia="Consolas" w:hAnsi="Consolas"/>
-                <w:sz w:val="20"/>
-                <w:szCs w:val="20"/>
-              </w:rPr>
-              <w:t xml:space="preserve">KCD2 Dice server (v0.5 online) listening on http://localhost:8080  (bound to all interfaces)</w:t>
+              <w:t xml:space="preserve">node --version    # v18.3.x или новее (любой 18.3+ / 20+)</w:t>
             </w:r>
           </w:p>
           <w:p>
@@ -1147,7 +984,7 @@
                 <w:sz w:val="20"/>
                 <w:szCs w:val="20"/>
               </w:rPr>
-              <w:t xml:space="preserve">Max rooms: 50.  Origin check: DISABLED (dev mode)</w:t>
+              <w:t xml:space="preserve">npm --version     # 9.x или новее</w:t>
             </w:r>
           </w:p>
         </w:tc>
@@ -1163,7 +1000,48 @@
           <w:sz w:val="22"/>
           <w:szCs w:val="22"/>
         </w:rPr>
-        <w:t xml:space="preserve">В другом SSH-окне (не закрывая первое) проверьте, что HTTP-эндпоинт жив:</w:t>
+        <w:t xml:space="preserve">Документация NodeSource: </w:t>
+      </w:r>
+      <w:hyperlink w:history="1" r:id="rIdxjv0ujwowbbfsxp7ribz1">
+        <w:r>
+          <w:rPr>
+            <w:rStyle w:val="Hyperlink"/>
+            <w:rFonts w:ascii="Arial" w:cs="Arial" w:eastAsia="Arial" w:hAnsi="Arial"/>
+            <w:sz w:val="22"/>
+            <w:szCs w:val="22"/>
+          </w:rPr>
+          <w:t xml:space="preserve">github.com/nodesource/distributions</w:t>
+        </w:r>
+      </w:hyperlink>
+    </w:p>
+    <w:p>
+      <w:pPr>
+        <w:pStyle w:val="Heading1"/>
+        <w:spacing w:after="200" w:before="360"/>
+      </w:pPr>
+      <w:r>
+        <w:rPr>
+          <w:rFonts w:ascii="Arial" w:cs="Arial" w:eastAsia="Arial" w:hAnsi="Arial"/>
+          <w:b/>
+          <w:bCs/>
+          <w:color w:val="1F4E79"/>
+          <w:sz w:val="36"/>
+          <w:szCs w:val="36"/>
+        </w:rPr>
+        <w:t xml:space="preserve">Шаг 3. Клонирование репозитория</w:t>
+      </w:r>
+    </w:p>
+    <w:p>
+      <w:pPr>
+        <w:spacing w:after="120" w:line="300"/>
+      </w:pPr>
+      <w:r>
+        <w:rPr>
+          <w:rFonts w:ascii="Arial" w:cs="Arial" w:eastAsia="Arial" w:hAnsi="Arial"/>
+          <w:sz w:val="22"/>
+          <w:szCs w:val="22"/>
+        </w:rPr>
+        <w:t xml:space="preserve">Создадим папку для проекта в домашней директории и склонируем туда ветку online-v0.5.</w:t>
       </w:r>
     </w:p>
     <w:tbl>
@@ -1209,6 +1087,378 @@
                 <w:sz w:val="20"/>
                 <w:szCs w:val="20"/>
               </w:rPr>
+              <w:t xml:space="preserve">cd ~</w:t>
+            </w:r>
+          </w:p>
+          <w:p>
+            <w:pPr>
+              <w:spacing w:after="40" w:line="260"/>
+            </w:pPr>
+            <w:r>
+              <w:rPr>
+                <w:rFonts w:ascii="Consolas" w:cs="Consolas" w:eastAsia="Consolas" w:hAnsi="Consolas"/>
+                <w:sz w:val="20"/>
+                <w:szCs w:val="20"/>
+              </w:rPr>
+              <w:t xml:space="preserve">git clone https://github.com/Lelbry/Kcd_dice_web_lan.git kcd2-dice</w:t>
+            </w:r>
+          </w:p>
+          <w:p>
+            <w:pPr>
+              <w:spacing w:after="40" w:line="260"/>
+            </w:pPr>
+            <w:r>
+              <w:rPr>
+                <w:rFonts w:ascii="Consolas" w:cs="Consolas" w:eastAsia="Consolas" w:hAnsi="Consolas"/>
+                <w:sz w:val="20"/>
+                <w:szCs w:val="20"/>
+              </w:rPr>
+              <w:t xml:space="preserve">cd kcd2-dice</w:t>
+            </w:r>
+          </w:p>
+          <w:p>
+            <w:pPr>
+              <w:spacing w:after="40" w:line="260"/>
+            </w:pPr>
+            <w:r>
+              <w:rPr>
+                <w:rFonts w:ascii="Consolas" w:cs="Consolas" w:eastAsia="Consolas" w:hAnsi="Consolas"/>
+                <w:sz w:val="20"/>
+                <w:szCs w:val="20"/>
+              </w:rPr>
+              <w:t xml:space="preserve">git checkout online-v0.5</w:t>
+            </w:r>
+          </w:p>
+          <w:p>
+            <w:pPr>
+              <w:spacing w:after="40" w:line="260"/>
+            </w:pPr>
+            <w:r>
+              <w:rPr>
+                <w:rFonts w:ascii="Consolas" w:cs="Consolas" w:eastAsia="Consolas" w:hAnsi="Consolas"/>
+                <w:sz w:val="20"/>
+                <w:szCs w:val="20"/>
+              </w:rPr>
+              <w:t xml:space="preserve"> </w:t>
+            </w:r>
+          </w:p>
+          <w:p>
+            <w:pPr>
+              <w:spacing w:after="40" w:line="260"/>
+            </w:pPr>
+            <w:r>
+              <w:rPr>
+                <w:rFonts w:ascii="Consolas" w:cs="Consolas" w:eastAsia="Consolas" w:hAnsi="Consolas"/>
+                <w:sz w:val="20"/>
+                <w:szCs w:val="20"/>
+              </w:rPr>
+              <w:t xml:space="preserve"># Установка зависимостей (express + ws)</w:t>
+            </w:r>
+          </w:p>
+          <w:p>
+            <w:pPr>
+              <w:spacing w:after="40" w:line="260"/>
+            </w:pPr>
+            <w:r>
+              <w:rPr>
+                <w:rFonts w:ascii="Consolas" w:cs="Consolas" w:eastAsia="Consolas" w:hAnsi="Consolas"/>
+                <w:sz w:val="20"/>
+                <w:szCs w:val="20"/>
+              </w:rPr>
+              <w:t xml:space="preserve">npm install</w:t>
+            </w:r>
+          </w:p>
+          <w:p>
+            <w:pPr>
+              <w:spacing w:after="40" w:line="260"/>
+            </w:pPr>
+            <w:r>
+              <w:rPr>
+                <w:rFonts w:ascii="Consolas" w:cs="Consolas" w:eastAsia="Consolas" w:hAnsi="Consolas"/>
+                <w:sz w:val="20"/>
+                <w:szCs w:val="20"/>
+              </w:rPr>
+              <w:t xml:space="preserve"> </w:t>
+            </w:r>
+          </w:p>
+          <w:p>
+            <w:pPr>
+              <w:spacing w:after="40" w:line="260"/>
+            </w:pPr>
+            <w:r>
+              <w:rPr>
+                <w:rFonts w:ascii="Consolas" w:cs="Consolas" w:eastAsia="Consolas" w:hAnsi="Consolas"/>
+                <w:sz w:val="20"/>
+                <w:szCs w:val="20"/>
+              </w:rPr>
+              <w:t xml:space="preserve"># Опционально — прогон тестов движка</w:t>
+            </w:r>
+          </w:p>
+          <w:p>
+            <w:pPr>
+              <w:spacing w:after="0" w:line="260"/>
+            </w:pPr>
+            <w:r>
+              <w:rPr>
+                <w:rFonts w:ascii="Consolas" w:cs="Consolas" w:eastAsia="Consolas" w:hAnsi="Consolas"/>
+                <w:sz w:val="20"/>
+                <w:szCs w:val="20"/>
+              </w:rPr>
+              <w:t xml:space="preserve">npm test</w:t>
+            </w:r>
+          </w:p>
+        </w:tc>
+      </w:tr>
+    </w:tbl>
+    <w:p>
+      <w:pPr>
+        <w:spacing w:after="120" w:line="300"/>
+      </w:pPr>
+      <w:r>
+        <w:rPr>
+          <w:rFonts w:ascii="Arial" w:cs="Arial" w:eastAsia="Arial" w:hAnsi="Arial"/>
+          <w:sz w:val="22"/>
+          <w:szCs w:val="22"/>
+        </w:rPr>
+        <w:t xml:space="preserve">После npm test должно отобразиться «pass 108, fail 0». Если есть сбои — остановитесь, не идём дальше.</w:t>
+      </w:r>
+    </w:p>
+    <w:p>
+      <w:pPr>
+        <w:pStyle w:val="Heading1"/>
+        <w:spacing w:after="200" w:before="360"/>
+      </w:pPr>
+      <w:r>
+        <w:rPr>
+          <w:rFonts w:ascii="Arial" w:cs="Arial" w:eastAsia="Arial" w:hAnsi="Arial"/>
+          <w:b/>
+          <w:bCs/>
+          <w:color w:val="1F4E79"/>
+          <w:sz w:val="36"/>
+          <w:szCs w:val="36"/>
+        </w:rPr>
+        <w:t xml:space="preserve">Шаг 4. Локальная проверка сервера</w:t>
+      </w:r>
+    </w:p>
+    <w:p>
+      <w:pPr>
+        <w:spacing w:after="120" w:line="300"/>
+      </w:pPr>
+      <w:r>
+        <w:rPr>
+          <w:rFonts w:ascii="Arial" w:cs="Arial" w:eastAsia="Arial" w:hAnsi="Arial"/>
+          <w:sz w:val="22"/>
+          <w:szCs w:val="22"/>
+        </w:rPr>
+        <w:t xml:space="preserve">Прежде чем настраивать туннель, проверим, что сервер вообще запускается.</w:t>
+      </w:r>
+    </w:p>
+    <w:tbl>
+      <w:tblPr>
+        <w:tblW w:type="dxa" w:w="9360"/>
+        <w:tblBorders>
+          <w:top w:val="single" w:color="auto" w:sz="4"/>
+          <w:left w:val="single" w:color="auto" w:sz="4"/>
+          <w:bottom w:val="single" w:color="auto" w:sz="4"/>
+          <w:right w:val="single" w:color="auto" w:sz="4"/>
+          <w:insideH w:val="single" w:color="auto" w:sz="4"/>
+          <w:insideV w:val="single" w:color="auto" w:sz="4"/>
+        </w:tblBorders>
+      </w:tblPr>
+      <w:tblGrid>
+        <w:gridCol w:w="9360"/>
+      </w:tblGrid>
+      <w:tr>
+        <w:tc>
+          <w:tcPr>
+            <w:tcW w:type="dxa" w:w="9360"/>
+            <w:tcBorders>
+              <w:top w:val="single" w:color="D0D0D0" w:sz="4"/>
+              <w:left w:val="single" w:color="D0D0D0" w:sz="4"/>
+              <w:bottom w:val="single" w:color="D0D0D0" w:sz="4"/>
+              <w:right w:val="single" w:color="D0D0D0" w:sz="4"/>
+            </w:tcBorders>
+            <w:shd w:fill="F4F4F4" w:val="clear"/>
+            <w:tcMar>
+              <w:top w:type="dxa" w:w="120"/>
+              <w:left w:type="dxa" w:w="180"/>
+              <w:bottom w:type="dxa" w:w="120"/>
+              <w:right w:type="dxa" w:w="180"/>
+            </w:tcMar>
+          </w:tcPr>
+          <w:p>
+            <w:pPr>
+              <w:spacing w:after="40" w:line="260"/>
+            </w:pPr>
+            <w:r>
+              <w:rPr>
+                <w:rFonts w:ascii="Consolas" w:cs="Consolas" w:eastAsia="Consolas" w:hAnsi="Consolas"/>
+                <w:sz w:val="20"/>
+                <w:szCs w:val="20"/>
+              </w:rPr>
+              <w:t xml:space="preserve">cd ~/kcd2-dice</w:t>
+            </w:r>
+          </w:p>
+          <w:p>
+            <w:pPr>
+              <w:spacing w:after="0" w:line="260"/>
+            </w:pPr>
+            <w:r>
+              <w:rPr>
+                <w:rFonts w:ascii="Consolas" w:cs="Consolas" w:eastAsia="Consolas" w:hAnsi="Consolas"/>
+                <w:sz w:val="20"/>
+                <w:szCs w:val="20"/>
+              </w:rPr>
+              <w:t xml:space="preserve">PORT=8080 npm start</w:t>
+            </w:r>
+          </w:p>
+        </w:tc>
+      </w:tr>
+    </w:tbl>
+    <w:p>
+      <w:pPr>
+        <w:spacing w:after="120" w:line="300"/>
+      </w:pPr>
+      <w:r>
+        <w:rPr>
+          <w:rFonts w:ascii="Arial" w:cs="Arial" w:eastAsia="Arial" w:hAnsi="Arial"/>
+          <w:sz w:val="22"/>
+          <w:szCs w:val="22"/>
+        </w:rPr>
+        <w:t xml:space="preserve">Должны увидеть:</w:t>
+      </w:r>
+    </w:p>
+    <w:tbl>
+      <w:tblPr>
+        <w:tblW w:type="dxa" w:w="9360"/>
+        <w:tblBorders>
+          <w:top w:val="single" w:color="auto" w:sz="4"/>
+          <w:left w:val="single" w:color="auto" w:sz="4"/>
+          <w:bottom w:val="single" w:color="auto" w:sz="4"/>
+          <w:right w:val="single" w:color="auto" w:sz="4"/>
+          <w:insideH w:val="single" w:color="auto" w:sz="4"/>
+          <w:insideV w:val="single" w:color="auto" w:sz="4"/>
+        </w:tblBorders>
+      </w:tblPr>
+      <w:tblGrid>
+        <w:gridCol w:w="9360"/>
+      </w:tblGrid>
+      <w:tr>
+        <w:tc>
+          <w:tcPr>
+            <w:tcW w:type="dxa" w:w="9360"/>
+            <w:tcBorders>
+              <w:top w:val="single" w:color="D0D0D0" w:sz="4"/>
+              <w:left w:val="single" w:color="D0D0D0" w:sz="4"/>
+              <w:bottom w:val="single" w:color="D0D0D0" w:sz="4"/>
+              <w:right w:val="single" w:color="D0D0D0" w:sz="4"/>
+            </w:tcBorders>
+            <w:shd w:fill="F4F4F4" w:val="clear"/>
+            <w:tcMar>
+              <w:top w:type="dxa" w:w="120"/>
+              <w:left w:type="dxa" w:w="180"/>
+              <w:bottom w:type="dxa" w:w="120"/>
+              <w:right w:type="dxa" w:w="180"/>
+            </w:tcMar>
+          </w:tcPr>
+          <w:p>
+            <w:pPr>
+              <w:spacing w:after="40" w:line="260"/>
+            </w:pPr>
+            <w:r>
+              <w:rPr>
+                <w:rFonts w:ascii="Consolas" w:cs="Consolas" w:eastAsia="Consolas" w:hAnsi="Consolas"/>
+                <w:sz w:val="20"/>
+                <w:szCs w:val="20"/>
+              </w:rPr>
+              <w:t xml:space="preserve">[WARN] ALLOWED_ORIGINS не задан — Origin не проверяется...</w:t>
+            </w:r>
+          </w:p>
+          <w:p>
+            <w:pPr>
+              <w:spacing w:after="40" w:line="260"/>
+            </w:pPr>
+            <w:r>
+              <w:rPr>
+                <w:rFonts w:ascii="Consolas" w:cs="Consolas" w:eastAsia="Consolas" w:hAnsi="Consolas"/>
+                <w:sz w:val="20"/>
+                <w:szCs w:val="20"/>
+              </w:rPr>
+              <w:t xml:space="preserve">KCD2 Dice server (v0.5 online) listening on http://localhost:8080  (bound to all interfaces)</w:t>
+            </w:r>
+          </w:p>
+          <w:p>
+            <w:pPr>
+              <w:spacing w:after="0" w:line="260"/>
+            </w:pPr>
+            <w:r>
+              <w:rPr>
+                <w:rFonts w:ascii="Consolas" w:cs="Consolas" w:eastAsia="Consolas" w:hAnsi="Consolas"/>
+                <w:sz w:val="20"/>
+                <w:szCs w:val="20"/>
+              </w:rPr>
+              <w:t xml:space="preserve">Max rooms: 50.  Origin check: DISABLED (dev mode)</w:t>
+            </w:r>
+          </w:p>
+        </w:tc>
+      </w:tr>
+    </w:tbl>
+    <w:p>
+      <w:pPr>
+        <w:spacing w:after="120" w:line="300"/>
+      </w:pPr>
+      <w:r>
+        <w:rPr>
+          <w:rFonts w:ascii="Arial" w:cs="Arial" w:eastAsia="Arial" w:hAnsi="Arial"/>
+          <w:sz w:val="22"/>
+          <w:szCs w:val="22"/>
+        </w:rPr>
+        <w:t xml:space="preserve">В другом SSH-окне (не закрывая первое) проверьте, что HTTP-эндпоинт жив:</w:t>
+      </w:r>
+    </w:p>
+    <w:tbl>
+      <w:tblPr>
+        <w:tblW w:type="dxa" w:w="9360"/>
+        <w:tblBorders>
+          <w:top w:val="single" w:color="auto" w:sz="4"/>
+          <w:left w:val="single" w:color="auto" w:sz="4"/>
+          <w:bottom w:val="single" w:color="auto" w:sz="4"/>
+          <w:right w:val="single" w:color="auto" w:sz="4"/>
+          <w:insideH w:val="single" w:color="auto" w:sz="4"/>
+          <w:insideV w:val="single" w:color="auto" w:sz="4"/>
+        </w:tblBorders>
+      </w:tblPr>
+      <w:tblGrid>
+        <w:gridCol w:w="9360"/>
+      </w:tblGrid>
+      <w:tr>
+        <w:tc>
+          <w:tcPr>
+            <w:tcW w:type="dxa" w:w="9360"/>
+            <w:tcBorders>
+              <w:top w:val="single" w:color="D0D0D0" w:sz="4"/>
+              <w:left w:val="single" w:color="D0D0D0" w:sz="4"/>
+              <w:bottom w:val="single" w:color="D0D0D0" w:sz="4"/>
+              <w:right w:val="single" w:color="D0D0D0" w:sz="4"/>
+            </w:tcBorders>
+            <w:shd w:fill="F4F4F4" w:val="clear"/>
+            <w:tcMar>
+              <w:top w:type="dxa" w:w="120"/>
+              <w:left w:type="dxa" w:w="180"/>
+              <w:bottom w:type="dxa" w:w="120"/>
+              <w:right w:type="dxa" w:w="180"/>
+            </w:tcMar>
+          </w:tcPr>
+          <w:p>
+            <w:pPr>
+              <w:spacing w:after="40" w:line="260"/>
+            </w:pPr>
+            <w:r>
+              <w:rPr>
+                <w:rFonts w:ascii="Consolas" w:cs="Consolas" w:eastAsia="Consolas" w:hAnsi="Consolas"/>
+                <w:sz w:val="20"/>
+                <w:szCs w:val="20"/>
+              </w:rPr>
               <w:t xml:space="preserve">curl http://localhost:8080/healthz</w:t>
             </w:r>
           </w:p>
@@ -1665,7 +1915,7 @@
         </w:rPr>
         <w:t xml:space="preserve">. Список всех вариантов: </w:t>
       </w:r>
-      <w:hyperlink w:history="1" r:id="rIdse-rx7yitohx4ku4yyjgr">
+      <w:hyperlink w:history="1" r:id="rIdgbnfgqlzqnqc4-zmpjh1l">
         <w:r>
           <w:rPr>
             <w:rStyle w:val="Hyperlink"/>
@@ -6040,7 +6290,7 @@
         </w:numPr>
         <w:spacing w:after="80" w:line="300"/>
       </w:pPr>
-      <w:hyperlink w:history="1" r:id="rIdprxz8juaau8rojlaax31e">
+      <w:hyperlink w:history="1" r:id="rIdc5d71grn8x4x5bbeylrhn">
         <w:r>
           <w:rPr>
             <w:rStyle w:val="Hyperlink"/>
@@ -6061,7 +6311,7 @@
         </w:numPr>
         <w:spacing w:after="80" w:line="300"/>
       </w:pPr>
-      <w:hyperlink w:history="1" r:id="rIdacnmv99ceg5htt4kcsf8a">
+      <w:hyperlink w:history="1" r:id="rIdhtjfuzensohpjmy9c_lt5">
         <w:r>
           <w:rPr>
             <w:rStyle w:val="Hyperlink"/>
@@ -6082,7 +6332,7 @@
         </w:numPr>
         <w:spacing w:after="80" w:line="300"/>
       </w:pPr>
-      <w:hyperlink w:history="1" r:id="rId5jjx6f_gc0rts48pdfygn">
+      <w:hyperlink w:history="1" r:id="rId4lu7kkuryx01yjf0da6qx">
         <w:r>
           <w:rPr>
             <w:rStyle w:val="Hyperlink"/>
@@ -6103,7 +6353,7 @@
         </w:numPr>
         <w:spacing w:after="80" w:line="300"/>
       </w:pPr>
-      <w:hyperlink w:history="1" r:id="rIdoxxq2anehed59pwj4xcfj">
+      <w:hyperlink w:history="1" r:id="rId9_eqgvlhrxd4o5qsxbmtx">
         <w:r>
           <w:rPr>
             <w:rStyle w:val="Hyperlink"/>
@@ -6124,7 +6374,7 @@
         </w:numPr>
         <w:spacing w:after="80" w:line="300"/>
       </w:pPr>
-      <w:hyperlink w:history="1" r:id="rIdnfqe4dek35vx24-naplfx">
+      <w:hyperlink w:history="1" r:id="rIdfyhaxcqpcld1ejxvov2re">
         <w:r>
           <w:rPr>
             <w:rStyle w:val="Hyperlink"/>

</xml_diff>